<commit_message>
Redesign diagrams to match reference style (navy circles, green entities, orange datastores)
DFD: sky-blue bg, dark-navy process circles, dark-green double-border external entities, orange-left data stores
Class diagram: clean white UML boxes with blue header, 10 classes with full attributes/methods/visibility/multiplicities

Co-authored-by: Hema Moganti <Vardhan11081@users.noreply.github.com>
</commit_message>
<xml_diff>
--- a/output/BN314_A2_Q5_Q6_Answer.docx
+++ b/output/BN314_A2_Q5_Q6_Answer.docx
@@ -335,7 +335,7 @@
       <w:r>
         <w:drawing>
           <wp:inline xmlns:a="http://schemas.openxmlformats.org/drawingml/2006/main" xmlns:pic="http://schemas.openxmlformats.org/drawingml/2006/picture">
-            <wp:extent cx="5943600" cy="4586613"/>
+            <wp:extent cx="5943600" cy="4315216"/>
             <wp:docPr id="1" name="Picture 1"/>
             <wp:cNvGraphicFramePr>
               <a:graphicFrameLocks noChangeAspect="1"/>
@@ -344,7 +344,7 @@
               <a:graphicData uri="http://schemas.openxmlformats.org/drawingml/2006/picture">
                 <pic:pic>
                   <pic:nvPicPr>
-                    <pic:cNvPr id="0" name="dfd_level1.png"/>
+                    <pic:cNvPr id="0" name="dfd_level1_v2.png"/>
                     <pic:cNvPicPr/>
                   </pic:nvPicPr>
                   <pic:blipFill>
@@ -356,7 +356,7 @@
                   <pic:spPr>
                     <a:xfrm>
                       <a:off x="0" y="0"/>
-                      <a:ext cx="5943600" cy="4586613"/>
+                      <a:ext cx="5943600" cy="4315216"/>
                     </a:xfrm>
                     <a:prstGeom prst="rect"/>
                   </pic:spPr>
@@ -819,7 +819,7 @@
       <w:r>
         <w:drawing>
           <wp:inline xmlns:a="http://schemas.openxmlformats.org/drawingml/2006/main" xmlns:pic="http://schemas.openxmlformats.org/drawingml/2006/picture">
-            <wp:extent cx="6217920" cy="5326462"/>
+            <wp:extent cx="6217920" cy="4777475"/>
             <wp:docPr id="2" name="Picture 2"/>
             <wp:cNvGraphicFramePr>
               <a:graphicFrameLocks noChangeAspect="1"/>
@@ -828,7 +828,7 @@
               <a:graphicData uri="http://schemas.openxmlformats.org/drawingml/2006/picture">
                 <pic:pic>
                   <pic:nvPicPr>
-                    <pic:cNvPr id="0" name="class_diagram.png"/>
+                    <pic:cNvPr id="0" name="class_diagram_v2.png"/>
                     <pic:cNvPicPr/>
                   </pic:nvPicPr>
                   <pic:blipFill>
@@ -840,7 +840,7 @@
                   <pic:spPr>
                     <a:xfrm>
                       <a:off x="0" y="0"/>
-                      <a:ext cx="6217920" cy="5326462"/>
+                      <a:ext cx="6217920" cy="4777475"/>
                     </a:xfrm>
                     <a:prstGeom prst="rect"/>
                   </pic:spPr>

</xml_diff>

<commit_message>
Redesign arrows: orthogonal polyline routing, no crossings (v3)
DFD: all flows use right-angle (H→V→H) paths via named waypoints;
     bidirectional flows offset on separate parallel tracks;
     Customer↔P2 routed via top margin; P5/P6→Customer via bottom margin.
Class: horizontal arrows within same row; vertical arrows across rows;
     long-range (User→Address, User→RewardPoints, User→has) routed via
     left/right page margins to avoid box crossings.

Co-authored-by: Hema Moganti <Vardhan11081@users.noreply.github.com>
</commit_message>
<xml_diff>
--- a/output/BN314_A2_Q5_Q6_Answer.docx
+++ b/output/BN314_A2_Q5_Q6_Answer.docx
@@ -335,7 +335,7 @@
       <w:r>
         <w:drawing>
           <wp:inline xmlns:a="http://schemas.openxmlformats.org/drawingml/2006/main" xmlns:pic="http://schemas.openxmlformats.org/drawingml/2006/picture">
-            <wp:extent cx="5943600" cy="4315216"/>
+            <wp:extent cx="5943600" cy="4202796"/>
             <wp:docPr id="1" name="Picture 1"/>
             <wp:cNvGraphicFramePr>
               <a:graphicFrameLocks noChangeAspect="1"/>
@@ -344,7 +344,7 @@
               <a:graphicData uri="http://schemas.openxmlformats.org/drawingml/2006/picture">
                 <pic:pic>
                   <pic:nvPicPr>
-                    <pic:cNvPr id="0" name="dfd_level1_v2.png"/>
+                    <pic:cNvPr id="0" name="dfd_v3.png"/>
                     <pic:cNvPicPr/>
                   </pic:nvPicPr>
                   <pic:blipFill>
@@ -356,7 +356,7 @@
                   <pic:spPr>
                     <a:xfrm>
                       <a:off x="0" y="0"/>
-                      <a:ext cx="5943600" cy="4315216"/>
+                      <a:ext cx="5943600" cy="4202796"/>
                     </a:xfrm>
                     <a:prstGeom prst="rect"/>
                   </pic:spPr>
@@ -819,7 +819,7 @@
       <w:r>
         <w:drawing>
           <wp:inline xmlns:a="http://schemas.openxmlformats.org/drawingml/2006/main" xmlns:pic="http://schemas.openxmlformats.org/drawingml/2006/picture">
-            <wp:extent cx="6217920" cy="4777475"/>
+            <wp:extent cx="6217920" cy="4880733"/>
             <wp:docPr id="2" name="Picture 2"/>
             <wp:cNvGraphicFramePr>
               <a:graphicFrameLocks noChangeAspect="1"/>
@@ -828,7 +828,7 @@
               <a:graphicData uri="http://schemas.openxmlformats.org/drawingml/2006/picture">
                 <pic:pic>
                   <pic:nvPicPr>
-                    <pic:cNvPr id="0" name="class_diagram_v2.png"/>
+                    <pic:cNvPr id="0" name="class_v3.png"/>
                     <pic:cNvPicPr/>
                   </pic:nvPicPr>
                   <pic:blipFill>
@@ -840,7 +840,7 @@
                   <pic:spPr>
                     <a:xfrm>
                       <a:off x="0" y="0"/>
-                      <a:ext cx="6217920" cy="4777475"/>
+                      <a:ext cx="6217920" cy="4880733"/>
                     </a:xfrm>
                     <a:prstGeom prst="rect"/>
                   </pic:spPr>

</xml_diff>